<commit_message>
format lại file word
</commit_message>
<xml_diff>
--- a/assets/1 thành viên/01. Giấy đề nghị.docx
+++ b/assets/1 thành viên/01. Giấy đề nghị.docx
@@ -4,7 +4,7 @@
   <w:body>
     <w:p>
       <w:pPr>
-        <w:spacing w:before="120" w:line="276" w:lineRule="auto"/>
+        <w:spacing w:line="300" w:lineRule="auto"/>
         <w:jc w:val="center"/>
         <w:rPr>
           <w:rFonts w:ascii="Times New Roman" w:hAnsi="Times New Roman" w:cs="Times New Roman"/>
@@ -41,7 +41,7 @@
     </w:p>
     <w:p>
       <w:pPr>
-        <w:spacing w:before="120" w:line="276" w:lineRule="auto"/>
+        <w:spacing w:line="300" w:lineRule="auto"/>
         <w:jc w:val="center"/>
         <w:rPr>
           <w:rFonts w:ascii="Times New Roman" w:hAnsi="Times New Roman" w:cs="Times New Roman"/>
@@ -115,7 +115,7 @@
     <w:bookmarkEnd w:id="0"/>
     <w:p>
       <w:pPr>
-        <w:spacing w:before="120" w:line="276" w:lineRule="auto"/>
+        <w:spacing w:line="300" w:lineRule="auto"/>
         <w:jc w:val="center"/>
         <w:rPr>
           <w:rFonts w:ascii="Times New Roman" w:hAnsi="Times New Roman" w:cs="Times New Roman"/>
@@ -143,7 +143,7 @@
     </w:p>
     <w:p>
       <w:pPr>
-        <w:spacing w:before="120" w:line="276" w:lineRule="auto"/>
+        <w:spacing w:line="300" w:lineRule="auto"/>
         <w:jc w:val="center"/>
         <w:rPr>
           <w:rFonts w:ascii="Times New Roman" w:hAnsi="Times New Roman" w:cs="Times New Roman"/>
@@ -169,7 +169,7 @@
     </w:p>
     <w:p>
       <w:pPr>
-        <w:spacing w:before="120" w:line="276" w:lineRule="auto"/>
+        <w:spacing w:line="300" w:lineRule="auto"/>
         <w:jc w:val="both"/>
         <w:rPr>
           <w:rFonts w:ascii="Times New Roman" w:hAnsi="Times New Roman" w:cs="Times New Roman"/>
@@ -224,7 +224,7 @@
     </w:p>
     <w:p>
       <w:pPr>
-        <w:spacing w:before="120" w:line="276" w:lineRule="auto"/>
+        <w:spacing w:line="300" w:lineRule="auto"/>
         <w:jc w:val="both"/>
         <w:rPr>
           <w:rFonts w:ascii="Times New Roman" w:hAnsi="Times New Roman" w:cs="Times New Roman"/>
@@ -268,7 +268,7 @@
     </w:p>
     <w:p>
       <w:pPr>
-        <w:spacing w:before="120" w:line="276" w:lineRule="auto"/>
+        <w:spacing w:line="300" w:lineRule="auto"/>
         <w:jc w:val="both"/>
         <w:rPr>
           <w:rFonts w:ascii="Times New Roman" w:hAnsi="Times New Roman" w:cs="Times New Roman"/>
@@ -293,7 +293,7 @@
     </w:p>
     <w:p>
       <w:pPr>
-        <w:spacing w:before="120" w:line="276" w:lineRule="auto"/>
+        <w:spacing w:line="300" w:lineRule="auto"/>
         <w:jc w:val="both"/>
         <w:rPr>
           <w:rFonts w:ascii="Times New Roman" w:hAnsi="Times New Roman" w:cs="Times New Roman"/>
@@ -325,7 +325,7 @@
         <w:tabs>
           <w:tab w:val="left" w:leader="dot" w:pos="8280"/>
         </w:tabs>
-        <w:spacing w:before="120" w:line="276" w:lineRule="auto"/>
+        <w:spacing w:line="300" w:lineRule="auto"/>
         <w:rPr>
           <w:rFonts w:ascii="Times New Roman" w:hAnsi="Times New Roman" w:cs="Times New Roman"/>
           <w:color w:val="auto"/>
@@ -344,7 +344,7 @@
         <w:tabs>
           <w:tab w:val="left" w:leader="dot" w:pos="8280"/>
         </w:tabs>
-        <w:spacing w:before="120" w:line="276" w:lineRule="auto"/>
+        <w:spacing w:line="300" w:lineRule="auto"/>
         <w:rPr>
           <w:rFonts w:ascii="Times New Roman" w:hAnsi="Times New Roman" w:cs="Times New Roman"/>
           <w:color w:val="auto"/>
@@ -372,7 +372,7 @@
         <w:tabs>
           <w:tab w:val="left" w:leader="dot" w:pos="8280"/>
         </w:tabs>
-        <w:spacing w:before="120" w:line="276" w:lineRule="auto"/>
+        <w:spacing w:line="300" w:lineRule="auto"/>
         <w:rPr>
           <w:rFonts w:ascii="Times New Roman" w:hAnsi="Times New Roman" w:cs="Times New Roman"/>
           <w:color w:val="auto"/>
@@ -400,7 +400,7 @@
         <w:tabs>
           <w:tab w:val="left" w:leader="dot" w:pos="8280"/>
         </w:tabs>
-        <w:spacing w:before="120" w:line="276" w:lineRule="auto"/>
+        <w:spacing w:line="300" w:lineRule="auto"/>
         <w:rPr>
           <w:rFonts w:ascii="Times New Roman" w:hAnsi="Times New Roman" w:cs="Times New Roman"/>
           <w:color w:val="auto"/>
@@ -428,7 +428,7 @@
         <w:tabs>
           <w:tab w:val="left" w:leader="dot" w:pos="8280"/>
         </w:tabs>
-        <w:spacing w:before="120" w:line="276" w:lineRule="auto"/>
+        <w:spacing w:line="300" w:lineRule="auto"/>
         <w:rPr>
           <w:rFonts w:ascii="Times New Roman" w:hAnsi="Times New Roman" w:cs="Times New Roman"/>
           <w:color w:val="auto"/>
@@ -454,7 +454,7 @@
     <w:bookmarkEnd w:id="2"/>
     <w:p>
       <w:pPr>
-        <w:spacing w:before="120" w:line="276" w:lineRule="auto"/>
+        <w:spacing w:line="300" w:lineRule="auto"/>
         <w:jc w:val="both"/>
         <w:rPr>
           <w:rFonts w:ascii="Times New Roman" w:hAnsi="Times New Roman" w:cs="Times New Roman"/>
@@ -486,7 +486,7 @@
     </w:p>
     <w:p>
       <w:pPr>
-        <w:spacing w:before="120" w:line="276" w:lineRule="auto"/>
+        <w:spacing w:line="300" w:lineRule="auto"/>
         <w:jc w:val="center"/>
         <w:rPr>
           <w:rFonts w:ascii="Times New Roman" w:hAnsi="Times New Roman" w:cs="Times New Roman"/>
@@ -514,7 +514,7 @@
     </w:p>
     <w:p>
       <w:pPr>
-        <w:spacing w:before="120" w:line="276" w:lineRule="auto"/>
+        <w:spacing w:line="300" w:lineRule="auto"/>
         <w:rPr>
           <w:rFonts w:ascii="Times New Roman" w:hAnsi="Times New Roman" w:cs="Times New Roman"/>
           <w:color w:val="auto"/>
@@ -574,7 +574,7 @@
               <w:tabs>
                 <w:tab w:val="left" w:pos="1152"/>
               </w:tabs>
-              <w:spacing w:before="120" w:line="276" w:lineRule="auto"/>
+              <w:spacing w:line="300" w:lineRule="auto"/>
               <w:rPr>
                 <w:rFonts w:ascii="Times New Roman" w:hAnsi="Times New Roman" w:cs="Times New Roman"/>
                 <w:color w:val="auto"/>
@@ -598,7 +598,7 @@
               <w:tabs>
                 <w:tab w:val="left" w:pos="1152"/>
               </w:tabs>
-              <w:spacing w:before="120" w:line="276" w:lineRule="auto"/>
+              <w:spacing w:line="300" w:lineRule="auto"/>
               <w:rPr>
                 <w:rFonts w:ascii="Times New Roman" w:hAnsi="Times New Roman" w:cs="Times New Roman"/>
                 <w:color w:val="auto"/>
@@ -624,7 +624,7 @@
               <w:tabs>
                 <w:tab w:val="left" w:pos="1152"/>
               </w:tabs>
-              <w:spacing w:before="120" w:line="276" w:lineRule="auto"/>
+              <w:spacing w:line="300" w:lineRule="auto"/>
               <w:rPr>
                 <w:rFonts w:ascii="Times New Roman" w:hAnsi="Times New Roman" w:cs="Times New Roman"/>
                 <w:color w:val="auto"/>
@@ -648,7 +648,7 @@
               <w:tabs>
                 <w:tab w:val="left" w:pos="1152"/>
               </w:tabs>
-              <w:spacing w:before="120" w:line="276" w:lineRule="auto"/>
+              <w:spacing w:line="300" w:lineRule="auto"/>
               <w:rPr>
                 <w:rFonts w:ascii="Times New Roman" w:hAnsi="Times New Roman" w:cs="Times New Roman"/>
                 <w:color w:val="auto"/>
@@ -674,7 +674,7 @@
               <w:tabs>
                 <w:tab w:val="left" w:pos="1152"/>
               </w:tabs>
-              <w:spacing w:before="120" w:line="276" w:lineRule="auto"/>
+              <w:spacing w:line="300" w:lineRule="auto"/>
               <w:rPr>
                 <w:rFonts w:ascii="Times New Roman" w:hAnsi="Times New Roman" w:cs="Times New Roman"/>
                 <w:color w:val="auto"/>
@@ -698,7 +698,7 @@
               <w:tabs>
                 <w:tab w:val="left" w:pos="1152"/>
               </w:tabs>
-              <w:spacing w:before="120" w:line="276" w:lineRule="auto"/>
+              <w:spacing w:line="300" w:lineRule="auto"/>
               <w:rPr>
                 <w:rFonts w:ascii="Times New Roman" w:hAnsi="Times New Roman" w:cs="Times New Roman"/>
                 <w:color w:val="auto"/>
@@ -724,7 +724,7 @@
               <w:tabs>
                 <w:tab w:val="left" w:pos="1152"/>
               </w:tabs>
-              <w:spacing w:before="120" w:line="276" w:lineRule="auto"/>
+              <w:spacing w:line="300" w:lineRule="auto"/>
               <w:rPr>
                 <w:rFonts w:ascii="Times New Roman" w:hAnsi="Times New Roman" w:cs="Times New Roman"/>
                 <w:color w:val="auto"/>
@@ -748,7 +748,7 @@
               <w:tabs>
                 <w:tab w:val="left" w:pos="1152"/>
               </w:tabs>
-              <w:spacing w:before="120" w:line="276" w:lineRule="auto"/>
+              <w:spacing w:line="300" w:lineRule="auto"/>
               <w:rPr>
                 <w:rFonts w:ascii="Times New Roman" w:hAnsi="Times New Roman" w:cs="Times New Roman"/>
                 <w:color w:val="auto"/>
@@ -774,7 +774,7 @@
               <w:tabs>
                 <w:tab w:val="left" w:pos="1152"/>
               </w:tabs>
-              <w:spacing w:before="120" w:line="276" w:lineRule="auto"/>
+              <w:spacing w:line="300" w:lineRule="auto"/>
               <w:rPr>
                 <w:rFonts w:ascii="Times New Roman" w:hAnsi="Times New Roman" w:cs="Times New Roman"/>
                 <w:color w:val="auto"/>
@@ -798,7 +798,7 @@
               <w:tabs>
                 <w:tab w:val="left" w:pos="1152"/>
               </w:tabs>
-              <w:spacing w:before="120" w:line="276" w:lineRule="auto"/>
+              <w:spacing w:line="300" w:lineRule="auto"/>
               <w:rPr>
                 <w:rFonts w:ascii="Times New Roman" w:hAnsi="Times New Roman" w:cs="Times New Roman"/>
                 <w:color w:val="auto"/>
@@ -824,7 +824,7 @@
               <w:tabs>
                 <w:tab w:val="left" w:pos="1152"/>
               </w:tabs>
-              <w:spacing w:before="120" w:line="276" w:lineRule="auto"/>
+              <w:spacing w:line="300" w:lineRule="auto"/>
               <w:rPr>
                 <w:rFonts w:ascii="Times New Roman" w:hAnsi="Times New Roman" w:cs="Times New Roman"/>
                 <w:color w:val="auto"/>
@@ -848,7 +848,7 @@
               <w:tabs>
                 <w:tab w:val="left" w:pos="1152"/>
               </w:tabs>
-              <w:spacing w:before="120" w:line="276" w:lineRule="auto"/>
+              <w:spacing w:line="300" w:lineRule="auto"/>
               <w:rPr>
                 <w:rFonts w:ascii="Times New Roman" w:hAnsi="Times New Roman" w:cs="Times New Roman"/>
                 <w:color w:val="auto"/>
@@ -874,7 +874,7 @@
               <w:tabs>
                 <w:tab w:val="left" w:pos="1152"/>
               </w:tabs>
-              <w:spacing w:before="120" w:line="276" w:lineRule="auto"/>
+              <w:spacing w:line="300" w:lineRule="auto"/>
               <w:rPr>
                 <w:rFonts w:ascii="Times New Roman" w:hAnsi="Times New Roman" w:cs="Times New Roman"/>
                 <w:color w:val="auto"/>
@@ -898,7 +898,7 @@
               <w:tabs>
                 <w:tab w:val="left" w:pos="1152"/>
               </w:tabs>
-              <w:spacing w:before="120" w:line="276" w:lineRule="auto"/>
+              <w:spacing w:line="300" w:lineRule="auto"/>
               <w:rPr>
                 <w:rFonts w:ascii="Times New Roman" w:hAnsi="Times New Roman" w:cs="Times New Roman"/>
                 <w:color w:val="auto"/>
@@ -917,7 +917,7 @@
     </w:tbl>
     <w:p>
       <w:pPr>
-        <w:spacing w:before="120" w:line="276" w:lineRule="auto"/>
+        <w:spacing w:line="300" w:lineRule="auto"/>
         <w:rPr>
           <w:rFonts w:ascii="Times New Roman" w:hAnsi="Times New Roman" w:cs="Times New Roman"/>
           <w:b/>
@@ -935,7 +935,7 @@
     </w:p>
     <w:p>
       <w:pPr>
-        <w:spacing w:before="120" w:line="276" w:lineRule="auto"/>
+        <w:spacing w:line="300" w:lineRule="auto"/>
         <w:rPr>
           <w:rFonts w:ascii="Times New Roman" w:hAnsi="Times New Roman" w:cs="Times New Roman"/>
           <w:b/>
@@ -963,7 +963,7 @@
     </w:p>
     <w:p>
       <w:pPr>
-        <w:spacing w:before="120" w:line="276" w:lineRule="auto"/>
+        <w:spacing w:line="300" w:lineRule="auto"/>
         <w:rPr>
           <w:rFonts w:ascii="Times New Roman" w:hAnsi="Times New Roman" w:cs="Times New Roman"/>
           <w:b/>
@@ -981,7 +981,7 @@
     </w:p>
     <w:p>
       <w:pPr>
-        <w:spacing w:before="120" w:line="276" w:lineRule="auto"/>
+        <w:spacing w:line="300" w:lineRule="auto"/>
         <w:rPr>
           <w:rFonts w:ascii="Times New Roman" w:hAnsi="Times New Roman" w:cs="Times New Roman"/>
           <w:color w:val="auto"/>
@@ -1008,7 +1008,7 @@
     <w:bookmarkEnd w:id="3"/>
     <w:p>
       <w:pPr>
-        <w:spacing w:before="120" w:line="276" w:lineRule="auto"/>
+        <w:spacing w:line="300" w:lineRule="auto"/>
         <w:rPr>
           <w:rFonts w:ascii="Times New Roman" w:hAnsi="Times New Roman" w:cs="Times New Roman"/>
           <w:b/>
@@ -1029,7 +1029,7 @@
         <w:tabs>
           <w:tab w:val="left" w:leader="dot" w:pos="8280"/>
         </w:tabs>
-        <w:spacing w:before="120" w:line="276" w:lineRule="auto"/>
+        <w:spacing w:line="300" w:lineRule="auto"/>
         <w:rPr>
           <w:rFonts w:ascii="Times New Roman" w:hAnsi="Times New Roman" w:cs="Times New Roman"/>
           <w:color w:val="auto"/>
@@ -1057,7 +1057,7 @@
         <w:tabs>
           <w:tab w:val="left" w:leader="dot" w:pos="8280"/>
         </w:tabs>
-        <w:spacing w:before="120" w:line="276" w:lineRule="auto"/>
+        <w:spacing w:line="300" w:lineRule="auto"/>
         <w:rPr>
           <w:rFonts w:ascii="Times New Roman" w:hAnsi="Times New Roman" w:cs="Times New Roman"/>
           <w:color w:val="auto"/>
@@ -1069,7 +1069,6 @@
           <w:rFonts w:ascii="Times New Roman" w:hAnsi="Times New Roman" w:cs="Times New Roman"/>
           <w:color w:val="auto"/>
         </w:rPr>
-        <w:lastRenderedPageBreak/>
         <w:t xml:space="preserve">Xã/Phường/Đặc khu: </w:t>
       </w:r>
       <w:r>
@@ -1086,7 +1085,7 @@
         <w:tabs>
           <w:tab w:val="left" w:leader="dot" w:pos="8280"/>
         </w:tabs>
-        <w:spacing w:before="120" w:line="276" w:lineRule="auto"/>
+        <w:spacing w:line="300" w:lineRule="auto"/>
         <w:rPr>
           <w:rFonts w:ascii="Times New Roman" w:hAnsi="Times New Roman" w:cs="Times New Roman"/>
           <w:color w:val="auto"/>
@@ -1111,7 +1110,7 @@
     </w:p>
     <w:p>
       <w:pPr>
-        <w:spacing w:line="276" w:lineRule="auto"/>
+        <w:spacing w:line="300" w:lineRule="auto"/>
         <w:ind w:right="57"/>
         <w:contextualSpacing/>
         <w:jc w:val="both"/>
@@ -1168,7 +1167,7 @@
     </w:p>
     <w:p>
       <w:pPr>
-        <w:spacing w:before="120" w:line="276" w:lineRule="auto"/>
+        <w:spacing w:line="300" w:lineRule="auto"/>
         <w:rPr>
           <w:rFonts w:ascii="Times New Roman" w:hAnsi="Times New Roman" w:cs="Times New Roman"/>
           <w:bCs/>
@@ -1228,7 +1227,7 @@
     </w:p>
     <w:p>
       <w:pPr>
-        <w:spacing w:line="276" w:lineRule="auto"/>
+        <w:spacing w:line="300" w:lineRule="auto"/>
         <w:ind w:right="57"/>
         <w:contextualSpacing/>
         <w:jc w:val="both"/>
@@ -1288,7 +1287,7 @@
           </w:tcPr>
           <w:p>
             <w:pPr>
-              <w:spacing w:before="120" w:line="276" w:lineRule="auto"/>
+              <w:spacing w:line="300" w:lineRule="auto"/>
               <w:rPr>
                 <w:rFonts w:ascii="Times New Roman" w:hAnsi="Times New Roman" w:cs="Times New Roman"/>
                 <w:color w:val="auto"/>
@@ -1317,7 +1316,7 @@
           </w:tcPr>
           <w:p>
             <w:pPr>
-              <w:spacing w:before="120" w:line="276" w:lineRule="auto"/>
+              <w:spacing w:line="300" w:lineRule="auto"/>
               <w:rPr>
                 <w:rFonts w:ascii="Times New Roman" w:hAnsi="Times New Roman" w:cs="Times New Roman"/>
                 <w:color w:val="auto"/>
@@ -1348,17 +1347,18 @@
           </w:tcPr>
           <w:p>
             <w:pPr>
-              <w:spacing w:before="120" w:line="276" w:lineRule="auto"/>
-              <w:rPr>
-                <w:rFonts w:ascii="Times New Roman" w:hAnsi="Times New Roman" w:cs="Times New Roman"/>
-                <w:color w:val="auto"/>
-              </w:rPr>
-            </w:pPr>
-            <w:r>
-              <w:rPr>
-                <w:rFonts w:ascii="Times New Roman" w:hAnsi="Times New Roman" w:cs="Times New Roman"/>
-                <w:color w:val="auto"/>
-              </w:rPr>
+              <w:spacing w:line="300" w:lineRule="auto"/>
+              <w:rPr>
+                <w:rFonts w:ascii="Times New Roman" w:hAnsi="Times New Roman" w:cs="Times New Roman"/>
+                <w:color w:val="auto"/>
+              </w:rPr>
+            </w:pPr>
+            <w:r>
+              <w:rPr>
+                <w:rFonts w:ascii="Times New Roman" w:hAnsi="Times New Roman" w:cs="Times New Roman"/>
+                <w:color w:val="auto"/>
+              </w:rPr>
+              <w:lastRenderedPageBreak/>
               <w:t>Khu chế xuất</w:t>
             </w:r>
           </w:p>
@@ -1376,7 +1376,7 @@
           </w:tcPr>
           <w:p>
             <w:pPr>
-              <w:spacing w:before="120" w:line="276" w:lineRule="auto"/>
+              <w:spacing w:line="300" w:lineRule="auto"/>
               <w:rPr>
                 <w:rFonts w:ascii="Times New Roman" w:hAnsi="Times New Roman" w:cs="Times New Roman"/>
                 <w:color w:val="auto"/>
@@ -1407,7 +1407,7 @@
           </w:tcPr>
           <w:p>
             <w:pPr>
-              <w:spacing w:before="120" w:line="276" w:lineRule="auto"/>
+              <w:spacing w:line="300" w:lineRule="auto"/>
               <w:rPr>
                 <w:rFonts w:ascii="Times New Roman" w:hAnsi="Times New Roman" w:cs="Times New Roman"/>
                 <w:color w:val="auto"/>
@@ -1435,7 +1435,7 @@
           </w:tcPr>
           <w:p>
             <w:pPr>
-              <w:spacing w:before="120" w:line="276" w:lineRule="auto"/>
+              <w:spacing w:line="300" w:lineRule="auto"/>
               <w:rPr>
                 <w:rFonts w:ascii="Times New Roman" w:hAnsi="Times New Roman" w:cs="Times New Roman"/>
                 <w:color w:val="auto"/>
@@ -1466,7 +1466,7 @@
           </w:tcPr>
           <w:p>
             <w:pPr>
-              <w:spacing w:before="120" w:line="276" w:lineRule="auto"/>
+              <w:spacing w:line="300" w:lineRule="auto"/>
               <w:rPr>
                 <w:rFonts w:ascii="Times New Roman" w:hAnsi="Times New Roman" w:cs="Times New Roman"/>
                 <w:color w:val="auto"/>
@@ -1494,7 +1494,7 @@
           </w:tcPr>
           <w:p>
             <w:pPr>
-              <w:spacing w:before="120" w:line="276" w:lineRule="auto"/>
+              <w:spacing w:line="300" w:lineRule="auto"/>
               <w:rPr>
                 <w:rFonts w:ascii="Times New Roman" w:hAnsi="Times New Roman" w:cs="Times New Roman"/>
                 <w:color w:val="auto"/>
@@ -1513,7 +1513,7 @@
     </w:tbl>
     <w:p>
       <w:pPr>
-        <w:spacing w:before="120" w:line="276" w:lineRule="auto"/>
+        <w:spacing w:line="300" w:lineRule="auto"/>
         <w:rPr>
           <w:rFonts w:ascii="Times New Roman" w:hAnsi="Times New Roman" w:cs="Times New Roman"/>
           <w:color w:val="auto"/>
@@ -1544,7 +1544,7 @@
     </w:p>
     <w:p>
       <w:pPr>
-        <w:spacing w:before="120" w:line="276" w:lineRule="auto"/>
+        <w:spacing w:line="300" w:lineRule="auto"/>
         <w:rPr>
           <w:rFonts w:ascii="Times New Roman" w:hAnsi="Times New Roman" w:cs="Times New Roman"/>
           <w:color w:val="auto"/>
@@ -1575,7 +1575,7 @@
     </w:p>
     <w:p>
       <w:pPr>
-        <w:spacing w:before="120" w:line="276" w:lineRule="auto"/>
+        <w:spacing w:line="300" w:lineRule="auto"/>
         <w:rPr>
           <w:rFonts w:ascii="Times New Roman" w:hAnsi="Times New Roman" w:cs="Times New Roman"/>
           <w:color w:val="auto"/>
@@ -1607,7 +1607,7 @@
     </w:p>
     <w:p>
       <w:pPr>
-        <w:spacing w:before="120" w:line="276" w:lineRule="auto"/>
+        <w:spacing w:line="300" w:lineRule="auto"/>
         <w:rPr>
           <w:rFonts w:ascii="Times New Roman" w:hAnsi="Times New Roman" w:cs="Times New Roman"/>
           <w:color w:val="auto"/>
@@ -1623,7 +1623,7 @@
     </w:p>
     <w:p>
       <w:pPr>
-        <w:spacing w:before="120" w:line="276" w:lineRule="auto"/>
+        <w:spacing w:line="300" w:lineRule="auto"/>
         <w:rPr>
           <w:rFonts w:ascii="Times New Roman" w:hAnsi="Times New Roman" w:cs="Times New Roman"/>
           <w:color w:val="auto"/>
@@ -1687,7 +1687,7 @@
           <w:p>
             <w:pPr>
               <w:snapToGrid w:val="0"/>
-              <w:spacing w:before="60"/>
+              <w:spacing w:line="300" w:lineRule="auto"/>
               <w:jc w:val="center"/>
               <w:rPr>
                 <w:rFonts w:ascii="Times New Roman" w:hAnsi="Times New Roman" w:cs="Times New Roman"/>
@@ -1724,7 +1724,7 @@
           <w:p>
             <w:pPr>
               <w:snapToGrid w:val="0"/>
-              <w:spacing w:before="60"/>
+              <w:spacing w:line="300" w:lineRule="auto"/>
               <w:jc w:val="center"/>
               <w:rPr>
                 <w:rFonts w:ascii="Times New Roman" w:hAnsi="Times New Roman" w:cs="Times New Roman"/>
@@ -1762,7 +1762,7 @@
           <w:p>
             <w:pPr>
               <w:snapToGrid w:val="0"/>
-              <w:spacing w:before="60"/>
+              <w:spacing w:line="300" w:lineRule="auto"/>
               <w:jc w:val="center"/>
               <w:rPr>
                 <w:rFonts w:ascii="Times New Roman" w:hAnsi="Times New Roman" w:cs="Times New Roman"/>
@@ -1800,7 +1800,7 @@
           <w:p>
             <w:pPr>
               <w:snapToGrid w:val="0"/>
-              <w:spacing w:before="60"/>
+              <w:spacing w:line="300" w:lineRule="auto"/>
               <w:jc w:val="center"/>
               <w:rPr>
                 <w:rFonts w:ascii="Times New Roman" w:hAnsi="Times New Roman" w:cs="Times New Roman"/>
@@ -1839,7 +1839,7 @@
           <w:p>
             <w:pPr>
               <w:snapToGrid w:val="0"/>
-              <w:spacing w:before="60"/>
+              <w:spacing w:line="300" w:lineRule="auto"/>
               <w:rPr>
                 <w:rFonts w:ascii="Times New Roman" w:hAnsi="Times New Roman" w:cs="Times New Roman"/>
                 <w:color w:val="auto"/>
@@ -1864,7 +1864,7 @@
           </w:tcPr>
           <w:p>
             <w:pPr>
-              <w:spacing w:beforeLines="20" w:before="48" w:afterLines="20" w:after="48"/>
+              <w:spacing w:beforeLines="20" w:before="48" w:afterLines="20" w:after="48" w:line="300" w:lineRule="auto"/>
               <w:rPr>
                 <w:rFonts w:ascii="Times New Roman" w:hAnsi="Times New Roman" w:cs="Times New Roman"/>
                 <w:i/>
@@ -1890,7 +1890,7 @@
           </w:tcPr>
           <w:p>
             <w:pPr>
-              <w:spacing w:beforeLines="20" w:before="48" w:afterLines="20" w:after="48"/>
+              <w:spacing w:beforeLines="20" w:before="48" w:afterLines="20" w:after="48" w:line="300" w:lineRule="auto"/>
               <w:jc w:val="center"/>
               <w:rPr>
                 <w:rFonts w:ascii="Times New Roman" w:hAnsi="Times New Roman" w:cs="Times New Roman"/>
@@ -1918,7 +1918,7 @@
           <w:p>
             <w:pPr>
               <w:snapToGrid w:val="0"/>
-              <w:spacing w:before="60"/>
+              <w:spacing w:line="300" w:lineRule="auto"/>
               <w:jc w:val="center"/>
               <w:rPr>
                 <w:rFonts w:ascii="Times New Roman" w:hAnsi="Times New Roman" w:cs="Times New Roman"/>
@@ -1937,7 +1937,7 @@
     </w:tbl>
     <w:p>
       <w:pPr>
-        <w:spacing w:before="120" w:line="276" w:lineRule="auto"/>
+        <w:spacing w:line="300" w:lineRule="auto"/>
         <w:rPr>
           <w:rFonts w:ascii="Times New Roman" w:hAnsi="Times New Roman" w:cs="Times New Roman"/>
           <w:b/>
@@ -1954,7 +1954,7 @@
     </w:p>
     <w:p>
       <w:pPr>
-        <w:spacing w:before="120" w:line="276" w:lineRule="auto"/>
+        <w:spacing w:line="300" w:lineRule="auto"/>
         <w:rPr>
           <w:rFonts w:ascii="Times New Roman" w:hAnsi="Times New Roman" w:cs="Times New Roman"/>
           <w:b/>
@@ -1972,7 +1972,7 @@
     </w:p>
     <w:p>
       <w:pPr>
-        <w:spacing w:before="120" w:line="276" w:lineRule="auto"/>
+        <w:spacing w:line="300" w:lineRule="auto"/>
         <w:jc w:val="both"/>
         <w:rPr>
           <w:rFonts w:ascii="Times New Roman" w:hAnsi="Times New Roman" w:cs="Times New Roman"/>
@@ -2014,7 +2014,7 @@
     </w:p>
     <w:p>
       <w:pPr>
-        <w:spacing w:before="120" w:line="276" w:lineRule="auto"/>
+        <w:spacing w:line="300" w:lineRule="auto"/>
         <w:jc w:val="both"/>
         <w:rPr>
           <w:rFonts w:ascii="Times New Roman" w:hAnsi="Times New Roman" w:cs="Times New Roman"/>
@@ -2058,7 +2058,7 @@
     </w:p>
     <w:p>
       <w:pPr>
-        <w:spacing w:before="120" w:line="276" w:lineRule="auto"/>
+        <w:spacing w:line="300" w:lineRule="auto"/>
         <w:jc w:val="both"/>
         <w:rPr>
           <w:rFonts w:ascii="Times New Roman" w:hAnsi="Times New Roman" w:cs="Times New Roman"/>
@@ -2083,7 +2083,7 @@
     </w:p>
     <w:p>
       <w:pPr>
-        <w:spacing w:before="120" w:line="276" w:lineRule="auto"/>
+        <w:spacing w:line="300" w:lineRule="auto"/>
         <w:jc w:val="both"/>
         <w:rPr>
           <w:rFonts w:ascii="Times New Roman" w:hAnsi="Times New Roman" w:cs="Times New Roman"/>
@@ -2114,7 +2114,7 @@
         <w:tabs>
           <w:tab w:val="left" w:leader="dot" w:pos="8280"/>
         </w:tabs>
-        <w:spacing w:before="120" w:line="276" w:lineRule="auto"/>
+        <w:spacing w:line="300" w:lineRule="auto"/>
         <w:rPr>
           <w:rFonts w:ascii="Times New Roman" w:hAnsi="Times New Roman" w:cs="Times New Roman"/>
           <w:color w:val="auto"/>
@@ -2133,7 +2133,7 @@
         <w:tabs>
           <w:tab w:val="left" w:leader="dot" w:pos="8280"/>
         </w:tabs>
-        <w:spacing w:before="120" w:line="276" w:lineRule="auto"/>
+        <w:spacing w:line="300" w:lineRule="auto"/>
         <w:rPr>
           <w:rFonts w:ascii="Times New Roman" w:hAnsi="Times New Roman" w:cs="Times New Roman"/>
           <w:color w:val="auto"/>
@@ -2161,7 +2161,7 @@
         <w:tabs>
           <w:tab w:val="left" w:leader="dot" w:pos="8280"/>
         </w:tabs>
-        <w:spacing w:before="120" w:line="276" w:lineRule="auto"/>
+        <w:spacing w:line="300" w:lineRule="auto"/>
         <w:rPr>
           <w:rFonts w:ascii="Times New Roman" w:hAnsi="Times New Roman" w:cs="Times New Roman"/>
           <w:color w:val="auto"/>
@@ -2173,7 +2173,6 @@
           <w:rFonts w:ascii="Times New Roman" w:hAnsi="Times New Roman" w:cs="Times New Roman"/>
           <w:color w:val="auto"/>
         </w:rPr>
-        <w:lastRenderedPageBreak/>
         <w:t xml:space="preserve">Xã/Phường/Đặc khu: </w:t>
       </w:r>
       <w:r>
@@ -2190,7 +2189,7 @@
         <w:tabs>
           <w:tab w:val="left" w:leader="dot" w:pos="8280"/>
         </w:tabs>
-        <w:spacing w:before="120" w:line="276" w:lineRule="auto"/>
+        <w:spacing w:line="300" w:lineRule="auto"/>
         <w:rPr>
           <w:rFonts w:ascii="Times New Roman" w:hAnsi="Times New Roman" w:cs="Times New Roman"/>
           <w:color w:val="auto"/>
@@ -2218,7 +2217,7 @@
         <w:tabs>
           <w:tab w:val="left" w:leader="dot" w:pos="8280"/>
         </w:tabs>
-        <w:spacing w:before="120" w:line="276" w:lineRule="auto"/>
+        <w:spacing w:line="300" w:lineRule="auto"/>
         <w:rPr>
           <w:rFonts w:ascii="Times New Roman" w:hAnsi="Times New Roman" w:cs="Times New Roman"/>
           <w:color w:val="auto"/>
@@ -2243,7 +2242,7 @@
     </w:p>
     <w:p>
       <w:pPr>
-        <w:spacing w:before="120" w:line="276" w:lineRule="auto"/>
+        <w:spacing w:line="300" w:lineRule="auto"/>
         <w:jc w:val="both"/>
         <w:rPr>
           <w:rFonts w:ascii="Times New Roman" w:hAnsi="Times New Roman" w:cs="Times New Roman"/>
@@ -2276,7 +2275,7 @@
     <w:bookmarkEnd w:id="6"/>
     <w:p>
       <w:pPr>
-        <w:spacing w:before="120" w:line="276" w:lineRule="auto"/>
+        <w:spacing w:line="300" w:lineRule="auto"/>
         <w:jc w:val="both"/>
         <w:rPr>
           <w:rFonts w:ascii="Times New Roman" w:hAnsi="Times New Roman" w:cs="Times New Roman"/>
@@ -2293,7 +2292,7 @@
     </w:p>
     <w:p>
       <w:pPr>
-        <w:spacing w:before="120" w:line="276" w:lineRule="auto"/>
+        <w:spacing w:line="300" w:lineRule="auto"/>
         <w:rPr>
           <w:rFonts w:ascii="Times New Roman" w:hAnsi="Times New Roman" w:cs="Times New Roman"/>
           <w:b/>
@@ -2314,7 +2313,7 @@
         <w:tabs>
           <w:tab w:val="left" w:leader="dot" w:pos="8280"/>
         </w:tabs>
-        <w:spacing w:before="120" w:line="276" w:lineRule="auto"/>
+        <w:spacing w:line="300" w:lineRule="auto"/>
         <w:rPr>
           <w:rFonts w:ascii="Times New Roman" w:hAnsi="Times New Roman" w:cs="Times New Roman"/>
           <w:color w:val="auto"/>
@@ -2370,7 +2369,7 @@
         <w:tabs>
           <w:tab w:val="left" w:leader="dot" w:pos="8280"/>
         </w:tabs>
-        <w:spacing w:before="120" w:line="276" w:lineRule="auto"/>
+        <w:spacing w:line="300" w:lineRule="auto"/>
         <w:rPr>
           <w:rFonts w:ascii="Times New Roman" w:hAnsi="Times New Roman" w:cs="Times New Roman"/>
           <w:color w:val="auto"/>
@@ -2426,7 +2425,7 @@
         <w:tabs>
           <w:tab w:val="left" w:leader="dot" w:pos="8280"/>
         </w:tabs>
-        <w:spacing w:before="120" w:line="276" w:lineRule="auto"/>
+        <w:spacing w:line="300" w:lineRule="auto"/>
         <w:rPr>
           <w:rFonts w:ascii="Times New Roman" w:hAnsi="Times New Roman" w:cs="Times New Roman"/>
           <w:color w:val="auto"/>
@@ -2457,17 +2456,18 @@
     </w:p>
     <w:p>
       <w:pPr>
-        <w:spacing w:before="120" w:line="276" w:lineRule="auto"/>
-        <w:rPr>
-          <w:rFonts w:ascii="Times New Roman" w:hAnsi="Times New Roman" w:cs="Times New Roman"/>
-          <w:color w:val="auto"/>
-        </w:rPr>
-      </w:pPr>
-      <w:r>
-        <w:rPr>
-          <w:rFonts w:ascii="Times New Roman" w:hAnsi="Times New Roman" w:cs="Times New Roman"/>
-          <w:color w:val="auto"/>
-        </w:rPr>
+        <w:spacing w:line="300" w:lineRule="auto"/>
+        <w:rPr>
+          <w:rFonts w:ascii="Times New Roman" w:hAnsi="Times New Roman" w:cs="Times New Roman"/>
+          <w:color w:val="auto"/>
+        </w:rPr>
+      </w:pPr>
+      <w:r>
+        <w:rPr>
+          <w:rFonts w:ascii="Times New Roman" w:hAnsi="Times New Roman" w:cs="Times New Roman"/>
+          <w:color w:val="auto"/>
+        </w:rPr>
+        <w:lastRenderedPageBreak/>
         <w:t xml:space="preserve">Có hiển thị thông tin về giá trị tương đương theo đơn vị tiền tệ nước ngoài trên Giấy chứng nhận đăng ký doanh nghiệp hay không?   Có □ Không </w:t>
       </w:r>
       <w:r>
@@ -2480,7 +2480,7 @@
     </w:p>
     <w:p>
       <w:pPr>
-        <w:spacing w:before="120" w:line="276" w:lineRule="auto"/>
+        <w:spacing w:line="300" w:lineRule="auto"/>
         <w:rPr>
           <w:rFonts w:ascii="Times New Roman" w:hAnsi="Times New Roman" w:cs="Times New Roman"/>
           <w:b/>
@@ -2527,7 +2527,7 @@
           </w:tcPr>
           <w:p>
             <w:pPr>
-              <w:spacing w:before="120" w:line="276" w:lineRule="auto"/>
+              <w:spacing w:line="300" w:lineRule="auto"/>
               <w:jc w:val="center"/>
               <w:rPr>
                 <w:rFonts w:ascii="Times New Roman" w:hAnsi="Times New Roman" w:cs="Times New Roman"/>
@@ -2558,7 +2558,7 @@
           </w:tcPr>
           <w:p>
             <w:pPr>
-              <w:spacing w:before="120" w:line="276" w:lineRule="auto"/>
+              <w:spacing w:line="300" w:lineRule="auto"/>
               <w:jc w:val="center"/>
               <w:rPr>
                 <w:rFonts w:ascii="Times New Roman" w:hAnsi="Times New Roman" w:cs="Times New Roman"/>
@@ -2606,7 +2606,7 @@
           </w:tcPr>
           <w:p>
             <w:pPr>
-              <w:spacing w:before="120" w:line="276" w:lineRule="auto"/>
+              <w:spacing w:line="300" w:lineRule="auto"/>
               <w:jc w:val="center"/>
               <w:rPr>
                 <w:rFonts w:ascii="Times New Roman" w:hAnsi="Times New Roman" w:cs="Times New Roman"/>
@@ -2659,7 +2659,7 @@
           </w:tcPr>
           <w:p>
             <w:pPr>
-              <w:spacing w:before="120" w:line="276" w:lineRule="auto"/>
+              <w:spacing w:line="300" w:lineRule="auto"/>
               <w:rPr>
                 <w:rFonts w:ascii="Times New Roman" w:hAnsi="Times New Roman" w:cs="Times New Roman"/>
                 <w:color w:val="auto"/>
@@ -2687,7 +2687,7 @@
           </w:tcPr>
           <w:p>
             <w:pPr>
-              <w:spacing w:before="120" w:line="276" w:lineRule="auto"/>
+              <w:spacing w:line="300" w:lineRule="auto"/>
               <w:jc w:val="center"/>
               <w:rPr>
                 <w:rFonts w:ascii="Times New Roman" w:hAnsi="Times New Roman" w:cs="Times New Roman"/>
@@ -2716,7 +2716,7 @@
           </w:tcPr>
           <w:p>
             <w:pPr>
-              <w:spacing w:before="120" w:line="276" w:lineRule="auto"/>
+              <w:spacing w:line="300" w:lineRule="auto"/>
               <w:jc w:val="center"/>
               <w:rPr>
                 <w:rFonts w:ascii="Times New Roman" w:hAnsi="Times New Roman" w:cs="Times New Roman"/>
@@ -2750,7 +2750,7 @@
           </w:tcPr>
           <w:p>
             <w:pPr>
-              <w:spacing w:before="120" w:line="276" w:lineRule="auto"/>
+              <w:spacing w:line="300" w:lineRule="auto"/>
               <w:rPr>
                 <w:rFonts w:ascii="Times New Roman" w:hAnsi="Times New Roman" w:cs="Times New Roman"/>
                 <w:color w:val="auto"/>
@@ -2778,7 +2778,7 @@
           </w:tcPr>
           <w:p>
             <w:pPr>
-              <w:spacing w:before="120" w:line="276" w:lineRule="auto"/>
+              <w:spacing w:line="300" w:lineRule="auto"/>
               <w:jc w:val="center"/>
               <w:rPr>
                 <w:rFonts w:ascii="Times New Roman" w:hAnsi="Times New Roman" w:cs="Times New Roman"/>
@@ -2820,7 +2820,7 @@
           </w:tcPr>
           <w:p>
             <w:pPr>
-              <w:spacing w:before="120" w:line="276" w:lineRule="auto"/>
+              <w:spacing w:line="300" w:lineRule="auto"/>
               <w:jc w:val="center"/>
               <w:rPr>
                 <w:rFonts w:ascii="Times New Roman" w:hAnsi="Times New Roman" w:cs="Times New Roman"/>
@@ -2854,7 +2854,7 @@
           </w:tcPr>
           <w:p>
             <w:pPr>
-              <w:spacing w:before="120" w:line="276" w:lineRule="auto"/>
+              <w:spacing w:line="300" w:lineRule="auto"/>
               <w:rPr>
                 <w:rFonts w:ascii="Times New Roman" w:hAnsi="Times New Roman" w:cs="Times New Roman"/>
                 <w:color w:val="auto"/>
@@ -2882,7 +2882,7 @@
           </w:tcPr>
           <w:p>
             <w:pPr>
-              <w:spacing w:before="120" w:line="276" w:lineRule="auto"/>
+              <w:spacing w:line="300" w:lineRule="auto"/>
               <w:jc w:val="center"/>
               <w:rPr>
                 <w:rFonts w:ascii="Times New Roman" w:hAnsi="Times New Roman" w:cs="Times New Roman"/>
@@ -2911,7 +2911,7 @@
           </w:tcPr>
           <w:p>
             <w:pPr>
-              <w:spacing w:before="120" w:line="276" w:lineRule="auto"/>
+              <w:spacing w:line="300" w:lineRule="auto"/>
               <w:jc w:val="center"/>
               <w:rPr>
                 <w:rFonts w:ascii="Times New Roman" w:hAnsi="Times New Roman" w:cs="Times New Roman"/>
@@ -2945,7 +2945,7 @@
           </w:tcPr>
           <w:p>
             <w:pPr>
-              <w:spacing w:before="120" w:line="276" w:lineRule="auto"/>
+              <w:spacing w:line="300" w:lineRule="auto"/>
               <w:rPr>
                 <w:rFonts w:ascii="Times New Roman" w:hAnsi="Times New Roman" w:cs="Times New Roman"/>
                 <w:color w:val="auto"/>
@@ -2973,7 +2973,7 @@
           </w:tcPr>
           <w:p>
             <w:pPr>
-              <w:spacing w:before="120" w:line="276" w:lineRule="auto"/>
+              <w:spacing w:line="300" w:lineRule="auto"/>
               <w:jc w:val="center"/>
               <w:rPr>
                 <w:rFonts w:ascii="Times New Roman" w:hAnsi="Times New Roman" w:cs="Times New Roman"/>
@@ -3002,7 +3002,7 @@
           </w:tcPr>
           <w:p>
             <w:pPr>
-              <w:spacing w:before="120" w:line="276" w:lineRule="auto"/>
+              <w:spacing w:line="300" w:lineRule="auto"/>
               <w:jc w:val="center"/>
               <w:rPr>
                 <w:rFonts w:ascii="Times New Roman" w:hAnsi="Times New Roman" w:cs="Times New Roman"/>
@@ -3036,7 +3036,7 @@
           </w:tcPr>
           <w:p>
             <w:pPr>
-              <w:spacing w:before="120" w:line="276" w:lineRule="auto"/>
+              <w:spacing w:line="300" w:lineRule="auto"/>
               <w:rPr>
                 <w:rFonts w:ascii="Times New Roman" w:hAnsi="Times New Roman" w:cs="Times New Roman"/>
                 <w:color w:val="auto"/>
@@ -3064,7 +3064,7 @@
           </w:tcPr>
           <w:p>
             <w:pPr>
-              <w:spacing w:before="120" w:line="276" w:lineRule="auto"/>
+              <w:spacing w:line="300" w:lineRule="auto"/>
               <w:jc w:val="center"/>
               <w:rPr>
                 <w:rFonts w:ascii="Times New Roman" w:hAnsi="Times New Roman" w:cs="Times New Roman"/>
@@ -3096,7 +3096,7 @@
           </w:tcPr>
           <w:p>
             <w:pPr>
-              <w:spacing w:before="120" w:line="276" w:lineRule="auto"/>
+              <w:spacing w:line="300" w:lineRule="auto"/>
               <w:jc w:val="center"/>
               <w:rPr>
                 <w:rFonts w:ascii="Times New Roman" w:hAnsi="Times New Roman" w:cs="Times New Roman"/>
@@ -3116,7 +3116,7 @@
     </w:tbl>
     <w:p>
       <w:pPr>
-        <w:spacing w:before="120" w:line="276" w:lineRule="auto"/>
+        <w:spacing w:line="300" w:lineRule="auto"/>
         <w:rPr>
           <w:rFonts w:ascii="Times New Roman" w:hAnsi="Times New Roman" w:cs="Times New Roman"/>
           <w:b/>
@@ -3152,7 +3152,7 @@
           </w:tcPr>
           <w:p>
             <w:pPr>
-              <w:spacing w:before="120" w:line="276" w:lineRule="auto"/>
+              <w:spacing w:line="300" w:lineRule="auto"/>
               <w:rPr>
                 <w:rFonts w:ascii="Times New Roman" w:hAnsi="Times New Roman" w:cs="Times New Roman"/>
                 <w:b/>
@@ -3176,7 +3176,7 @@
           </w:tcPr>
           <w:p>
             <w:pPr>
-              <w:spacing w:before="120" w:line="276" w:lineRule="auto"/>
+              <w:spacing w:line="300" w:lineRule="auto"/>
               <w:jc w:val="center"/>
               <w:rPr>
                 <w:rFonts w:ascii="Times New Roman" w:hAnsi="Times New Roman" w:cs="Times New Roman"/>
@@ -3201,7 +3201,7 @@
           </w:tcPr>
           <w:p>
             <w:pPr>
-              <w:spacing w:before="120" w:line="276" w:lineRule="auto"/>
+              <w:spacing w:line="300" w:lineRule="auto"/>
               <w:jc w:val="center"/>
               <w:rPr>
                 <w:rFonts w:ascii="Times New Roman" w:hAnsi="Times New Roman" w:cs="Times New Roman"/>
@@ -3243,7 +3243,7 @@
           </w:tcPr>
           <w:p>
             <w:pPr>
-              <w:spacing w:before="120" w:line="276" w:lineRule="auto"/>
+              <w:spacing w:line="300" w:lineRule="auto"/>
               <w:jc w:val="center"/>
               <w:rPr>
                 <w:rFonts w:ascii="Times New Roman" w:hAnsi="Times New Roman" w:cs="Times New Roman"/>
@@ -3262,7 +3262,7 @@
           </w:p>
           <w:p>
             <w:pPr>
-              <w:spacing w:before="120" w:line="276" w:lineRule="auto"/>
+              <w:spacing w:line="300" w:lineRule="auto"/>
               <w:jc w:val="center"/>
               <w:rPr>
                 <w:rFonts w:ascii="Times New Roman" w:hAnsi="Times New Roman" w:cs="Times New Roman"/>
@@ -3306,7 +3306,7 @@
           </w:tcPr>
           <w:p>
             <w:pPr>
-              <w:spacing w:before="120" w:line="276" w:lineRule="auto"/>
+              <w:spacing w:line="300" w:lineRule="auto"/>
               <w:rPr>
                 <w:rFonts w:ascii="Times New Roman" w:hAnsi="Times New Roman" w:cs="Times New Roman"/>
                 <w:b/>
@@ -3329,7 +3329,7 @@
           </w:tcPr>
           <w:p>
             <w:pPr>
-              <w:spacing w:before="120" w:line="276" w:lineRule="auto"/>
+              <w:spacing w:line="300" w:lineRule="auto"/>
               <w:jc w:val="both"/>
               <w:rPr>
                 <w:rFonts w:ascii="Times New Roman" w:hAnsi="Times New Roman" w:cs="Times New Roman"/>
@@ -3352,7 +3352,7 @@
           </w:tcPr>
           <w:p>
             <w:pPr>
-              <w:spacing w:before="120" w:line="276" w:lineRule="auto"/>
+              <w:spacing w:line="300" w:lineRule="auto"/>
               <w:jc w:val="center"/>
               <w:rPr>
                 <w:rFonts w:ascii="Times New Roman" w:hAnsi="Times New Roman" w:cs="Times New Roman"/>
@@ -3379,7 +3379,7 @@
           </w:tcPr>
           <w:p>
             <w:pPr>
-              <w:spacing w:before="120" w:line="276" w:lineRule="auto"/>
+              <w:spacing w:line="300" w:lineRule="auto"/>
               <w:jc w:val="center"/>
               <w:rPr>
                 <w:rFonts w:ascii="Times New Roman" w:hAnsi="Times New Roman" w:cs="Times New Roman"/>
@@ -3405,7 +3405,7 @@
           </w:tcPr>
           <w:p>
             <w:pPr>
-              <w:spacing w:before="120" w:line="276" w:lineRule="auto"/>
+              <w:spacing w:line="300" w:lineRule="auto"/>
               <w:rPr>
                 <w:rFonts w:ascii="Times New Roman" w:hAnsi="Times New Roman" w:cs="Times New Roman"/>
                 <w:b/>
@@ -3428,7 +3428,7 @@
           </w:tcPr>
           <w:p>
             <w:pPr>
-              <w:spacing w:before="120" w:line="276" w:lineRule="auto"/>
+              <w:spacing w:line="300" w:lineRule="auto"/>
               <w:jc w:val="both"/>
               <w:rPr>
                 <w:rFonts w:ascii="Times New Roman" w:hAnsi="Times New Roman" w:cs="Times New Roman"/>
@@ -3451,7 +3451,7 @@
           </w:tcPr>
           <w:p>
             <w:pPr>
-              <w:spacing w:before="120" w:line="276" w:lineRule="auto"/>
+              <w:spacing w:line="300" w:lineRule="auto"/>
               <w:jc w:val="center"/>
               <w:rPr>
                 <w:rFonts w:ascii="Times New Roman" w:hAnsi="Times New Roman" w:cs="Times New Roman"/>
@@ -3475,7 +3475,7 @@
           </w:tcPr>
           <w:p>
             <w:pPr>
-              <w:spacing w:before="120" w:line="276" w:lineRule="auto"/>
+              <w:spacing w:line="300" w:lineRule="auto"/>
               <w:jc w:val="center"/>
               <w:rPr>
                 <w:rFonts w:ascii="Times New Roman" w:hAnsi="Times New Roman" w:cs="Times New Roman"/>
@@ -3501,7 +3501,7 @@
           </w:tcPr>
           <w:p>
             <w:pPr>
-              <w:spacing w:before="120" w:line="276" w:lineRule="auto"/>
+              <w:spacing w:line="300" w:lineRule="auto"/>
               <w:rPr>
                 <w:rFonts w:ascii="Times New Roman" w:hAnsi="Times New Roman" w:cs="Times New Roman"/>
                 <w:b/>
@@ -3524,7 +3524,7 @@
           </w:tcPr>
           <w:p>
             <w:pPr>
-              <w:spacing w:before="120" w:line="276" w:lineRule="auto"/>
+              <w:spacing w:line="300" w:lineRule="auto"/>
               <w:jc w:val="both"/>
               <w:rPr>
                 <w:rFonts w:ascii="Times New Roman" w:hAnsi="Times New Roman" w:cs="Times New Roman"/>
@@ -3547,7 +3547,7 @@
           </w:tcPr>
           <w:p>
             <w:pPr>
-              <w:spacing w:before="120" w:line="276" w:lineRule="auto"/>
+              <w:spacing w:line="300" w:lineRule="auto"/>
               <w:jc w:val="center"/>
               <w:rPr>
                 <w:rFonts w:ascii="Times New Roman" w:hAnsi="Times New Roman" w:cs="Times New Roman"/>
@@ -3571,7 +3571,7 @@
           </w:tcPr>
           <w:p>
             <w:pPr>
-              <w:spacing w:before="120" w:line="276" w:lineRule="auto"/>
+              <w:spacing w:line="300" w:lineRule="auto"/>
               <w:jc w:val="center"/>
               <w:rPr>
                 <w:rFonts w:ascii="Times New Roman" w:hAnsi="Times New Roman" w:cs="Times New Roman"/>
@@ -3597,7 +3597,7 @@
           </w:tcPr>
           <w:p>
             <w:pPr>
-              <w:spacing w:before="120" w:line="276" w:lineRule="auto"/>
+              <w:spacing w:line="300" w:lineRule="auto"/>
               <w:rPr>
                 <w:rFonts w:ascii="Times New Roman" w:hAnsi="Times New Roman" w:cs="Times New Roman"/>
                 <w:b/>
@@ -3620,7 +3620,7 @@
           </w:tcPr>
           <w:p>
             <w:pPr>
-              <w:spacing w:before="120" w:line="276" w:lineRule="auto"/>
+              <w:spacing w:line="300" w:lineRule="auto"/>
               <w:jc w:val="both"/>
               <w:rPr>
                 <w:rFonts w:ascii="Times New Roman" w:hAnsi="Times New Roman" w:cs="Times New Roman"/>
@@ -3643,7 +3643,7 @@
           </w:tcPr>
           <w:p>
             <w:pPr>
-              <w:spacing w:before="120" w:line="276" w:lineRule="auto"/>
+              <w:spacing w:line="300" w:lineRule="auto"/>
               <w:jc w:val="center"/>
               <w:rPr>
                 <w:rFonts w:ascii="Times New Roman" w:hAnsi="Times New Roman" w:cs="Times New Roman"/>
@@ -3667,7 +3667,7 @@
           </w:tcPr>
           <w:p>
             <w:pPr>
-              <w:spacing w:before="120" w:line="276" w:lineRule="auto"/>
+              <w:spacing w:line="300" w:lineRule="auto"/>
               <w:jc w:val="center"/>
               <w:rPr>
                 <w:rFonts w:ascii="Times New Roman" w:hAnsi="Times New Roman" w:cs="Times New Roman"/>
@@ -3693,7 +3693,7 @@
           </w:tcPr>
           <w:p>
             <w:pPr>
-              <w:spacing w:before="120" w:line="276" w:lineRule="auto"/>
+              <w:spacing w:line="300" w:lineRule="auto"/>
               <w:rPr>
                 <w:rFonts w:ascii="Times New Roman" w:hAnsi="Times New Roman" w:cs="Times New Roman"/>
                 <w:b/>
@@ -3716,7 +3716,7 @@
           </w:tcPr>
           <w:p>
             <w:pPr>
-              <w:spacing w:before="120" w:line="276" w:lineRule="auto"/>
+              <w:spacing w:line="300" w:lineRule="auto"/>
               <w:jc w:val="both"/>
               <w:rPr>
                 <w:rFonts w:ascii="Times New Roman" w:hAnsi="Times New Roman" w:cs="Times New Roman"/>
@@ -3739,7 +3739,7 @@
           </w:tcPr>
           <w:p>
             <w:pPr>
-              <w:spacing w:before="120" w:line="276" w:lineRule="auto"/>
+              <w:spacing w:line="300" w:lineRule="auto"/>
               <w:jc w:val="center"/>
               <w:rPr>
                 <w:rFonts w:ascii="Times New Roman" w:hAnsi="Times New Roman" w:cs="Times New Roman"/>
@@ -3763,7 +3763,7 @@
           </w:tcPr>
           <w:p>
             <w:pPr>
-              <w:spacing w:before="120" w:line="276" w:lineRule="auto"/>
+              <w:spacing w:line="300" w:lineRule="auto"/>
               <w:jc w:val="center"/>
               <w:rPr>
                 <w:rFonts w:ascii="Times New Roman" w:hAnsi="Times New Roman" w:cs="Times New Roman"/>
@@ -3789,7 +3789,7 @@
           </w:tcPr>
           <w:p>
             <w:pPr>
-              <w:spacing w:before="120" w:line="276" w:lineRule="auto"/>
+              <w:spacing w:line="300" w:lineRule="auto"/>
               <w:rPr>
                 <w:rFonts w:ascii="Times New Roman" w:hAnsi="Times New Roman" w:cs="Times New Roman"/>
                 <w:b/>
@@ -3812,7 +3812,7 @@
           </w:tcPr>
           <w:p>
             <w:pPr>
-              <w:spacing w:before="120" w:line="276" w:lineRule="auto"/>
+              <w:spacing w:line="300" w:lineRule="auto"/>
               <w:jc w:val="both"/>
               <w:rPr>
                 <w:rFonts w:ascii="Times New Roman" w:hAnsi="Times New Roman" w:cs="Times New Roman"/>
@@ -3835,7 +3835,7 @@
           </w:tcPr>
           <w:p>
             <w:pPr>
-              <w:spacing w:before="120" w:line="276" w:lineRule="auto"/>
+              <w:spacing w:line="300" w:lineRule="auto"/>
               <w:jc w:val="center"/>
               <w:rPr>
                 <w:rFonts w:ascii="Times New Roman" w:hAnsi="Times New Roman" w:cs="Times New Roman"/>
@@ -3859,7 +3859,7 @@
           </w:tcPr>
           <w:p>
             <w:pPr>
-              <w:spacing w:before="120" w:line="276" w:lineRule="auto"/>
+              <w:spacing w:line="300" w:lineRule="auto"/>
               <w:jc w:val="center"/>
               <w:rPr>
                 <w:rFonts w:ascii="Times New Roman" w:hAnsi="Times New Roman" w:cs="Times New Roman"/>
@@ -3886,7 +3886,7 @@
           </w:tcPr>
           <w:p>
             <w:pPr>
-              <w:spacing w:before="120" w:line="276" w:lineRule="auto"/>
+              <w:spacing w:line="300" w:lineRule="auto"/>
               <w:jc w:val="center"/>
               <w:rPr>
                 <w:rFonts w:ascii="Times New Roman" w:hAnsi="Times New Roman" w:cs="Times New Roman"/>
@@ -3910,7 +3910,7 @@
           </w:tcPr>
           <w:p>
             <w:pPr>
-              <w:spacing w:before="120" w:line="276" w:lineRule="auto"/>
+              <w:spacing w:line="300" w:lineRule="auto"/>
               <w:jc w:val="center"/>
               <w:rPr>
                 <w:rFonts w:ascii="Times New Roman" w:hAnsi="Times New Roman" w:cs="Times New Roman"/>
@@ -3937,7 +3937,7 @@
           </w:tcPr>
           <w:p>
             <w:pPr>
-              <w:spacing w:before="120" w:line="276" w:lineRule="auto"/>
+              <w:spacing w:line="300" w:lineRule="auto"/>
               <w:jc w:val="center"/>
               <w:rPr>
                 <w:rFonts w:ascii="Times New Roman" w:hAnsi="Times New Roman" w:cs="Times New Roman"/>
@@ -3959,7 +3959,7 @@
     </w:tbl>
     <w:p>
       <w:pPr>
-        <w:spacing w:before="120" w:line="276" w:lineRule="auto"/>
+        <w:spacing w:line="300" w:lineRule="auto"/>
         <w:rPr>
           <w:rFonts w:ascii="Times New Roman" w:hAnsi="Times New Roman" w:cs="Times New Roman"/>
           <w:b/>
@@ -3977,7 +3977,7 @@
     </w:p>
     <w:p>
       <w:pPr>
-        <w:spacing w:before="120" w:line="276" w:lineRule="auto"/>
+        <w:spacing w:line="300" w:lineRule="auto"/>
         <w:jc w:val="both"/>
         <w:rPr>
           <w:rFonts w:ascii="Times New Roman" w:hAnsi="Times New Roman" w:cs="Times New Roman"/>
@@ -4015,7 +4015,7 @@
     </w:p>
     <w:p>
       <w:pPr>
-        <w:spacing w:before="120" w:line="276" w:lineRule="auto"/>
+        <w:spacing w:line="300" w:lineRule="auto"/>
         <w:jc w:val="both"/>
         <w:rPr>
           <w:rFonts w:ascii="Times New Roman" w:hAnsi="Times New Roman" w:cs="Times New Roman"/>
@@ -4059,7 +4059,7 @@
     </w:p>
     <w:p>
       <w:pPr>
-        <w:spacing w:before="120" w:line="276" w:lineRule="auto"/>
+        <w:spacing w:line="300" w:lineRule="auto"/>
         <w:jc w:val="both"/>
         <w:rPr>
           <w:rFonts w:ascii="Times New Roman" w:hAnsi="Times New Roman" w:cs="Times New Roman"/>
@@ -4071,7 +4071,6 @@
           <w:rFonts w:ascii="Times New Roman" w:hAnsi="Times New Roman" w:cs="Times New Roman"/>
           <w:color w:val="auto"/>
         </w:rPr>
-        <w:lastRenderedPageBreak/>
         <w:t xml:space="preserve">Giới tính: </w:t>
       </w:r>
       <w:r>
@@ -4085,7 +4084,7 @@
     </w:p>
     <w:p>
       <w:pPr>
-        <w:spacing w:before="120" w:line="276" w:lineRule="auto"/>
+        <w:spacing w:line="300" w:lineRule="auto"/>
         <w:rPr>
           <w:rFonts w:ascii="Times New Roman" w:hAnsi="Times New Roman" w:cs="Times New Roman"/>
           <w:color w:val="auto"/>
@@ -4126,7 +4125,7 @@
         <w:tabs>
           <w:tab w:val="left" w:leader="dot" w:pos="8280"/>
         </w:tabs>
-        <w:spacing w:before="120" w:line="276" w:lineRule="auto"/>
+        <w:spacing w:line="300" w:lineRule="auto"/>
         <w:rPr>
           <w:rFonts w:ascii="Times New Roman" w:hAnsi="Times New Roman" w:cs="Times New Roman"/>
           <w:color w:val="auto"/>
@@ -4145,7 +4144,7 @@
         <w:tabs>
           <w:tab w:val="left" w:leader="dot" w:pos="8280"/>
         </w:tabs>
-        <w:spacing w:before="120" w:line="276" w:lineRule="auto"/>
+        <w:spacing w:line="300" w:lineRule="auto"/>
         <w:rPr>
           <w:rFonts w:ascii="Times New Roman" w:hAnsi="Times New Roman" w:cs="Times New Roman"/>
           <w:color w:val="auto"/>
@@ -4173,7 +4172,7 @@
         <w:tabs>
           <w:tab w:val="left" w:leader="dot" w:pos="8280"/>
         </w:tabs>
-        <w:spacing w:before="120" w:line="276" w:lineRule="auto"/>
+        <w:spacing w:line="300" w:lineRule="auto"/>
         <w:rPr>
           <w:rFonts w:ascii="Times New Roman" w:hAnsi="Times New Roman" w:cs="Times New Roman"/>
           <w:color w:val="auto"/>
@@ -4201,7 +4200,7 @@
         <w:tabs>
           <w:tab w:val="left" w:leader="dot" w:pos="8280"/>
         </w:tabs>
-        <w:spacing w:before="120" w:line="276" w:lineRule="auto"/>
+        <w:spacing w:line="300" w:lineRule="auto"/>
         <w:rPr>
           <w:rFonts w:ascii="Times New Roman" w:hAnsi="Times New Roman" w:cs="Times New Roman"/>
           <w:color w:val="auto"/>
@@ -4229,7 +4228,7 @@
         <w:tabs>
           <w:tab w:val="left" w:leader="dot" w:pos="8280"/>
         </w:tabs>
-        <w:spacing w:before="120" w:line="276" w:lineRule="auto"/>
+        <w:spacing w:line="300" w:lineRule="auto"/>
         <w:rPr>
           <w:rFonts w:ascii="Times New Roman" w:hAnsi="Times New Roman" w:cs="Times New Roman"/>
           <w:color w:val="auto"/>
@@ -4254,7 +4253,7 @@
     </w:p>
     <w:p>
       <w:pPr>
-        <w:spacing w:before="120" w:line="276" w:lineRule="auto"/>
+        <w:spacing w:line="300" w:lineRule="auto"/>
         <w:jc w:val="both"/>
         <w:rPr>
           <w:rFonts w:ascii="Times New Roman" w:hAnsi="Times New Roman" w:cs="Times New Roman"/>
@@ -4287,7 +4286,7 @@
     <w:bookmarkEnd w:id="9"/>
     <w:p>
       <w:pPr>
-        <w:spacing w:before="120" w:line="276" w:lineRule="auto"/>
+        <w:spacing w:line="300" w:lineRule="auto"/>
         <w:rPr>
           <w:rFonts w:ascii="Times New Roman" w:hAnsi="Times New Roman" w:cs="Times New Roman"/>
           <w:b/>
@@ -4330,7 +4329,7 @@
           </w:tcPr>
           <w:p>
             <w:pPr>
-              <w:spacing w:before="120" w:line="276" w:lineRule="auto"/>
+              <w:spacing w:line="300" w:lineRule="auto"/>
               <w:jc w:val="center"/>
               <w:rPr>
                 <w:rFonts w:ascii="Times New Roman" w:hAnsi="Times New Roman" w:cs="Times New Roman"/>
@@ -4359,7 +4358,7 @@
           </w:tcPr>
           <w:p>
             <w:pPr>
-              <w:spacing w:before="120" w:line="276" w:lineRule="auto"/>
+              <w:spacing w:line="300" w:lineRule="auto"/>
               <w:jc w:val="center"/>
               <w:rPr>
                 <w:rFonts w:ascii="Times New Roman" w:hAnsi="Times New Roman" w:cs="Times New Roman"/>
@@ -4390,7 +4389,7 @@
           </w:tcPr>
           <w:p>
             <w:pPr>
-              <w:spacing w:before="120" w:line="276" w:lineRule="auto"/>
+              <w:spacing w:line="300" w:lineRule="auto"/>
               <w:jc w:val="center"/>
               <w:rPr>
                 <w:rFonts w:ascii="Times New Roman" w:hAnsi="Times New Roman" w:cs="Times New Roman"/>
@@ -4419,7 +4418,7 @@
           </w:tcPr>
           <w:p>
             <w:pPr>
-              <w:spacing w:before="120" w:line="276" w:lineRule="auto"/>
+              <w:spacing w:line="300" w:lineRule="auto"/>
               <w:rPr>
                 <w:rFonts w:ascii="Times New Roman" w:hAnsi="Times New Roman" w:cs="Times New Roman"/>
                 <w:color w:val="auto"/>
@@ -4451,7 +4450,7 @@
           </w:p>
           <w:p>
             <w:pPr>
-              <w:spacing w:before="120" w:line="276" w:lineRule="auto"/>
+              <w:spacing w:line="300" w:lineRule="auto"/>
               <w:jc w:val="both"/>
               <w:rPr>
                 <w:rFonts w:ascii="Times New Roman" w:hAnsi="Times New Roman" w:cs="Times New Roman"/>
@@ -4480,7 +4479,7 @@
           </w:p>
           <w:p>
             <w:pPr>
-              <w:spacing w:before="120" w:line="276" w:lineRule="auto"/>
+              <w:spacing w:line="300" w:lineRule="auto"/>
               <w:jc w:val="both"/>
               <w:rPr>
                 <w:rFonts w:ascii="Times New Roman" w:hAnsi="Times New Roman" w:cs="Times New Roman"/>
@@ -4524,7 +4523,7 @@
           </w:p>
           <w:p>
             <w:pPr>
-              <w:spacing w:before="120" w:line="276" w:lineRule="auto"/>
+              <w:spacing w:line="300" w:lineRule="auto"/>
               <w:jc w:val="both"/>
               <w:rPr>
                 <w:rFonts w:ascii="Times New Roman" w:hAnsi="Times New Roman" w:cs="Times New Roman"/>
@@ -4549,7 +4548,7 @@
           </w:p>
           <w:p>
             <w:pPr>
-              <w:spacing w:before="120" w:line="276" w:lineRule="auto"/>
+              <w:spacing w:line="300" w:lineRule="auto"/>
               <w:rPr>
                 <w:rFonts w:ascii="Times New Roman" w:eastAsia="Times New Roman" w:hAnsi="Times New Roman" w:cs="Times New Roman"/>
                 <w:color w:val="auto"/>
@@ -4578,7 +4577,7 @@
           </w:p>
           <w:p>
             <w:pPr>
-              <w:spacing w:before="120" w:line="276" w:lineRule="auto"/>
+              <w:spacing w:line="300" w:lineRule="auto"/>
               <w:rPr>
                 <w:rFonts w:ascii="Times New Roman" w:hAnsi="Times New Roman" w:cs="Times New Roman"/>
                 <w:color w:val="auto"/>
@@ -4617,7 +4616,7 @@
           </w:tcPr>
           <w:p>
             <w:pPr>
-              <w:spacing w:before="120" w:line="276" w:lineRule="auto"/>
+              <w:spacing w:line="300" w:lineRule="auto"/>
               <w:jc w:val="center"/>
               <w:rPr>
                 <w:rFonts w:ascii="Times New Roman" w:hAnsi="Times New Roman" w:cs="Times New Roman"/>
@@ -4629,6 +4628,7 @@
                 <w:rFonts w:ascii="Times New Roman" w:hAnsi="Times New Roman" w:cs="Times New Roman"/>
                 <w:color w:val="auto"/>
               </w:rPr>
+              <w:lastRenderedPageBreak/>
               <w:t>10.2</w:t>
             </w:r>
           </w:p>
@@ -4646,7 +4646,7 @@
           </w:tcPr>
           <w:p>
             <w:pPr>
-              <w:spacing w:before="120" w:line="276" w:lineRule="auto"/>
+              <w:spacing w:line="300" w:lineRule="auto"/>
               <w:rPr>
                 <w:rFonts w:ascii="Times New Roman" w:hAnsi="Times New Roman" w:cs="Times New Roman"/>
                 <w:color w:val="auto"/>
@@ -4678,7 +4678,7 @@
           </w:p>
           <w:p>
             <w:pPr>
-              <w:spacing w:before="120" w:line="276" w:lineRule="auto"/>
+              <w:spacing w:line="300" w:lineRule="auto"/>
               <w:rPr>
                 <w:rFonts w:ascii="Times New Roman" w:hAnsi="Times New Roman" w:cs="Times New Roman"/>
                 <w:color w:val="auto"/>
@@ -4694,7 +4694,7 @@
           </w:p>
           <w:p>
             <w:pPr>
-              <w:spacing w:before="120" w:line="276" w:lineRule="auto"/>
+              <w:spacing w:line="300" w:lineRule="auto"/>
               <w:rPr>
                 <w:rFonts w:ascii="Times New Roman" w:hAnsi="Times New Roman" w:cs="Times New Roman"/>
                 <w:color w:val="auto"/>
@@ -4710,7 +4710,7 @@
           </w:p>
           <w:p>
             <w:pPr>
-              <w:spacing w:before="120" w:line="276" w:lineRule="auto"/>
+              <w:spacing w:line="300" w:lineRule="auto"/>
               <w:rPr>
                 <w:rFonts w:ascii="Times New Roman" w:hAnsi="Times New Roman" w:cs="Times New Roman"/>
                 <w:color w:val="auto"/>
@@ -4726,7 +4726,7 @@
           </w:p>
           <w:p>
             <w:pPr>
-              <w:spacing w:before="120" w:line="276" w:lineRule="auto"/>
+              <w:spacing w:line="300" w:lineRule="auto"/>
               <w:rPr>
                 <w:rFonts w:ascii="Times New Roman" w:hAnsi="Times New Roman" w:cs="Times New Roman"/>
                 <w:color w:val="auto"/>
@@ -4742,7 +4742,7 @@
           </w:p>
           <w:p>
             <w:pPr>
-              <w:spacing w:before="120" w:line="276" w:lineRule="auto"/>
+              <w:spacing w:line="300" w:lineRule="auto"/>
               <w:rPr>
                 <w:rFonts w:ascii="Times New Roman" w:hAnsi="Times New Roman" w:cs="Times New Roman"/>
                 <w:color w:val="auto"/>
@@ -4772,7 +4772,7 @@
           </w:tcPr>
           <w:p>
             <w:pPr>
-              <w:spacing w:before="120" w:line="276" w:lineRule="auto"/>
+              <w:spacing w:line="300" w:lineRule="auto"/>
               <w:jc w:val="center"/>
               <w:rPr>
                 <w:rFonts w:ascii="Times New Roman" w:hAnsi="Times New Roman" w:cs="Times New Roman"/>
@@ -4801,7 +4801,7 @@
           </w:tcPr>
           <w:p>
             <w:pPr>
-              <w:spacing w:before="120" w:line="276" w:lineRule="auto"/>
+              <w:spacing w:line="300" w:lineRule="auto"/>
               <w:rPr>
                 <w:rFonts w:ascii="Times New Roman" w:hAnsi="Times New Roman" w:cs="Times New Roman"/>
                 <w:color w:val="auto"/>
@@ -4832,7 +4832,7 @@
           </w:p>
           <w:p>
             <w:pPr>
-              <w:spacing w:before="120" w:line="276" w:lineRule="auto"/>
+              <w:spacing w:line="300" w:lineRule="auto"/>
               <w:rPr>
                 <w:rFonts w:ascii="Times New Roman" w:hAnsi="Times New Roman" w:cs="Times New Roman"/>
                 <w:color w:val="auto"/>
@@ -4848,7 +4848,7 @@
           </w:p>
           <w:p>
             <w:pPr>
-              <w:spacing w:before="120" w:line="276" w:lineRule="auto"/>
+              <w:spacing w:line="300" w:lineRule="auto"/>
               <w:rPr>
                 <w:rFonts w:ascii="Times New Roman" w:hAnsi="Times New Roman" w:cs="Times New Roman"/>
                 <w:color w:val="auto"/>
@@ -4864,7 +4864,7 @@
           </w:p>
           <w:p>
             <w:pPr>
-              <w:spacing w:before="120" w:line="276" w:lineRule="auto"/>
+              <w:spacing w:line="300" w:lineRule="auto"/>
               <w:rPr>
                 <w:rFonts w:ascii="Times New Roman" w:hAnsi="Times New Roman" w:cs="Times New Roman"/>
                 <w:color w:val="auto"/>
@@ -4880,7 +4880,7 @@
           </w:p>
           <w:p>
             <w:pPr>
-              <w:spacing w:before="120" w:line="276" w:lineRule="auto"/>
+              <w:spacing w:line="300" w:lineRule="auto"/>
               <w:rPr>
                 <w:rFonts w:ascii="Times New Roman" w:hAnsi="Times New Roman" w:cs="Times New Roman"/>
                 <w:color w:val="auto"/>
@@ -4928,7 +4928,7 @@
           </w:p>
           <w:p>
             <w:pPr>
-              <w:spacing w:before="120" w:line="276" w:lineRule="auto"/>
+              <w:spacing w:line="300" w:lineRule="auto"/>
               <w:rPr>
                 <w:rFonts w:ascii="Times New Roman" w:hAnsi="Times New Roman" w:cs="Times New Roman"/>
                 <w:color w:val="auto"/>
@@ -4975,7 +4975,7 @@
           </w:tcPr>
           <w:p>
             <w:pPr>
-              <w:spacing w:before="120" w:line="276" w:lineRule="auto"/>
+              <w:spacing w:line="300" w:lineRule="auto"/>
               <w:jc w:val="center"/>
               <w:rPr>
                 <w:rFonts w:ascii="Times New Roman" w:hAnsi="Times New Roman" w:cs="Times New Roman"/>
@@ -5004,7 +5004,7 @@
           </w:tcPr>
           <w:p>
             <w:pPr>
-              <w:spacing w:before="120" w:line="276" w:lineRule="auto"/>
+              <w:spacing w:line="300" w:lineRule="auto"/>
               <w:rPr>
                 <w:rFonts w:ascii="Times New Roman" w:hAnsi="Times New Roman" w:cs="Times New Roman"/>
                 <w:color w:val="auto"/>
@@ -5049,7 +5049,7 @@
           </w:tcPr>
           <w:p>
             <w:pPr>
-              <w:spacing w:before="120" w:line="276" w:lineRule="auto"/>
+              <w:spacing w:line="300" w:lineRule="auto"/>
               <w:jc w:val="center"/>
               <w:rPr>
                 <w:rFonts w:ascii="Times New Roman" w:hAnsi="Times New Roman" w:cs="Times New Roman"/>
@@ -5061,7 +5061,6 @@
                 <w:rFonts w:ascii="Times New Roman" w:hAnsi="Times New Roman" w:cs="Times New Roman"/>
                 <w:color w:val="auto"/>
               </w:rPr>
-              <w:lastRenderedPageBreak/>
               <w:t>10.5</w:t>
             </w:r>
           </w:p>
@@ -5079,7 +5078,7 @@
           </w:tcPr>
           <w:p>
             <w:pPr>
-              <w:spacing w:before="120" w:line="276" w:lineRule="auto"/>
+              <w:spacing w:line="300" w:lineRule="auto"/>
               <w:rPr>
                 <w:rFonts w:ascii="Times New Roman" w:hAnsi="Times New Roman" w:cs="Times New Roman"/>
                 <w:color w:val="auto"/>
@@ -5127,7 +5126,7 @@
                     <w:tabs>
                       <w:tab w:val="left" w:pos="1152"/>
                     </w:tabs>
-                    <w:spacing w:before="120" w:line="276" w:lineRule="auto"/>
+                    <w:spacing w:line="300" w:lineRule="auto"/>
                     <w:rPr>
                       <w:rFonts w:ascii="Times New Roman" w:hAnsi="Times New Roman" w:cs="Times New Roman"/>
                       <w:color w:val="auto"/>
@@ -5158,7 +5157,7 @@
                     <w:tabs>
                       <w:tab w:val="left" w:pos="1152"/>
                     </w:tabs>
-                    <w:spacing w:before="120" w:line="276" w:lineRule="auto"/>
+                    <w:spacing w:line="300" w:lineRule="auto"/>
                     <w:rPr>
                       <w:rFonts w:ascii="Times New Roman" w:hAnsi="Times New Roman" w:cs="Times New Roman"/>
                       <w:color w:val="auto"/>
@@ -5184,7 +5183,7 @@
                     <w:tabs>
                       <w:tab w:val="left" w:pos="1152"/>
                     </w:tabs>
-                    <w:spacing w:before="120" w:line="276" w:lineRule="auto"/>
+                    <w:spacing w:line="300" w:lineRule="auto"/>
                     <w:rPr>
                       <w:rFonts w:ascii="Times New Roman" w:hAnsi="Times New Roman" w:cs="Times New Roman"/>
                       <w:color w:val="auto"/>
@@ -5208,7 +5207,7 @@
                     <w:tabs>
                       <w:tab w:val="left" w:pos="1152"/>
                     </w:tabs>
-                    <w:spacing w:before="120" w:line="276" w:lineRule="auto"/>
+                    <w:spacing w:line="300" w:lineRule="auto"/>
                     <w:rPr>
                       <w:rFonts w:ascii="Times New Roman" w:hAnsi="Times New Roman" w:cs="Times New Roman"/>
                       <w:color w:val="auto"/>
@@ -5220,7 +5219,7 @@
           </w:tbl>
           <w:p>
             <w:pPr>
-              <w:spacing w:before="120" w:line="276" w:lineRule="auto"/>
+              <w:spacing w:line="300" w:lineRule="auto"/>
               <w:rPr>
                 <w:rFonts w:ascii="Times New Roman" w:hAnsi="Times New Roman" w:cs="Times New Roman"/>
                 <w:color w:val="auto"/>
@@ -5243,7 +5242,7 @@
           </w:tcPr>
           <w:p>
             <w:pPr>
-              <w:spacing w:before="120" w:line="276" w:lineRule="auto"/>
+              <w:spacing w:line="300" w:lineRule="auto"/>
               <w:jc w:val="center"/>
               <w:rPr>
                 <w:rFonts w:ascii="Times New Roman" w:hAnsi="Times New Roman" w:cs="Times New Roman"/>
@@ -5272,7 +5271,7 @@
           </w:tcPr>
           <w:p>
             <w:pPr>
-              <w:spacing w:before="120" w:line="276" w:lineRule="auto"/>
+              <w:spacing w:line="300" w:lineRule="auto"/>
               <w:rPr>
                 <w:rFonts w:ascii="Times New Roman" w:hAnsi="Times New Roman" w:cs="Times New Roman"/>
                 <w:color w:val="auto"/>
@@ -5296,7 +5295,7 @@
           </w:p>
           <w:p>
             <w:pPr>
-              <w:spacing w:before="120" w:line="276" w:lineRule="auto"/>
+              <w:spacing w:line="300" w:lineRule="auto"/>
               <w:rPr>
                 <w:rFonts w:ascii="Times New Roman" w:hAnsi="Times New Roman" w:cs="Times New Roman"/>
                 <w:i/>
@@ -5328,7 +5327,7 @@
           </w:tcPr>
           <w:p>
             <w:pPr>
-              <w:spacing w:before="120" w:line="276" w:lineRule="auto"/>
+              <w:spacing w:line="300" w:lineRule="auto"/>
               <w:jc w:val="center"/>
               <w:rPr>
                 <w:rFonts w:ascii="Times New Roman" w:hAnsi="Times New Roman" w:cs="Times New Roman"/>
@@ -5357,7 +5356,7 @@
           </w:tcPr>
           <w:p>
             <w:pPr>
-              <w:spacing w:before="120" w:line="276" w:lineRule="auto"/>
+              <w:spacing w:line="300" w:lineRule="auto"/>
               <w:rPr>
                 <w:rFonts w:ascii="Times New Roman" w:hAnsi="Times New Roman" w:cs="Times New Roman"/>
                 <w:color w:val="auto"/>
@@ -5387,7 +5386,7 @@
           </w:tcPr>
           <w:p>
             <w:pPr>
-              <w:spacing w:before="120" w:line="276" w:lineRule="auto"/>
+              <w:spacing w:line="300" w:lineRule="auto"/>
               <w:jc w:val="center"/>
               <w:rPr>
                 <w:rFonts w:ascii="Times New Roman" w:hAnsi="Times New Roman" w:cs="Times New Roman"/>
@@ -5416,7 +5415,7 @@
           </w:tcPr>
           <w:p>
             <w:pPr>
-              <w:spacing w:before="120" w:line="276" w:lineRule="auto"/>
+              <w:spacing w:line="300" w:lineRule="auto"/>
               <w:rPr>
                 <w:rFonts w:ascii="Times New Roman" w:hAnsi="Times New Roman" w:cs="Times New Roman"/>
                 <w:color w:val="auto"/>
@@ -5449,7 +5448,7 @@
                     <w:tabs>
                       <w:tab w:val="left" w:pos="1152"/>
                     </w:tabs>
-                    <w:spacing w:before="120" w:line="276" w:lineRule="auto"/>
+                    <w:spacing w:line="300" w:lineRule="auto"/>
                     <w:rPr>
                       <w:rFonts w:ascii="Times New Roman" w:hAnsi="Times New Roman" w:cs="Times New Roman"/>
                       <w:color w:val="auto"/>
@@ -5473,7 +5472,7 @@
                     <w:tabs>
                       <w:tab w:val="left" w:pos="1152"/>
                     </w:tabs>
-                    <w:spacing w:before="120" w:line="276" w:lineRule="auto"/>
+                    <w:spacing w:line="300" w:lineRule="auto"/>
                     <w:rPr>
                       <w:rFonts w:ascii="Times New Roman" w:hAnsi="Times New Roman" w:cs="Times New Roman"/>
                       <w:color w:val="auto"/>
@@ -5499,7 +5498,7 @@
           </w:tbl>
           <w:p>
             <w:pPr>
-              <w:spacing w:before="120" w:line="276" w:lineRule="auto"/>
+              <w:spacing w:line="300" w:lineRule="auto"/>
               <w:rPr>
                 <w:rFonts w:ascii="Times New Roman" w:hAnsi="Times New Roman" w:cs="Times New Roman"/>
                 <w:color w:val="auto"/>
@@ -5522,7 +5521,7 @@
           </w:tcPr>
           <w:p>
             <w:pPr>
-              <w:spacing w:before="120" w:line="276" w:lineRule="auto"/>
+              <w:spacing w:line="300" w:lineRule="auto"/>
               <w:jc w:val="center"/>
               <w:rPr>
                 <w:rFonts w:ascii="Times New Roman" w:hAnsi="Times New Roman" w:cs="Times New Roman"/>
@@ -5551,7 +5550,7 @@
           </w:tcPr>
           <w:p>
             <w:pPr>
-              <w:spacing w:before="120" w:line="276" w:lineRule="auto"/>
+              <w:spacing w:line="300" w:lineRule="auto"/>
               <w:rPr>
                 <w:rFonts w:ascii="Times New Roman" w:hAnsi="Times New Roman" w:cs="Times New Roman"/>
                 <w:color w:val="auto"/>
@@ -5599,7 +5598,7 @@
                     <w:tabs>
                       <w:tab w:val="left" w:pos="1152"/>
                     </w:tabs>
-                    <w:spacing w:before="120" w:line="276" w:lineRule="auto"/>
+                    <w:spacing w:line="300" w:lineRule="auto"/>
                     <w:rPr>
                       <w:rFonts w:ascii="Times New Roman" w:hAnsi="Times New Roman" w:cs="Times New Roman"/>
                       <w:color w:val="auto"/>
@@ -5623,7 +5622,7 @@
                     <w:tabs>
                       <w:tab w:val="left" w:pos="1152"/>
                     </w:tabs>
-                    <w:spacing w:before="120" w:line="276" w:lineRule="auto"/>
+                    <w:spacing w:line="300" w:lineRule="auto"/>
                     <w:rPr>
                       <w:rFonts w:ascii="Times New Roman" w:hAnsi="Times New Roman" w:cs="Times New Roman"/>
                       <w:color w:val="auto"/>
@@ -5649,7 +5648,7 @@
                     <w:tabs>
                       <w:tab w:val="left" w:pos="1152"/>
                     </w:tabs>
-                    <w:spacing w:before="120" w:line="276" w:lineRule="auto"/>
+                    <w:spacing w:line="300" w:lineRule="auto"/>
                     <w:rPr>
                       <w:rFonts w:ascii="Times New Roman" w:hAnsi="Times New Roman" w:cs="Times New Roman"/>
                       <w:color w:val="auto"/>
@@ -5673,7 +5672,7 @@
                     <w:tabs>
                       <w:tab w:val="left" w:pos="1152"/>
                     </w:tabs>
-                    <w:spacing w:before="120" w:line="276" w:lineRule="auto"/>
+                    <w:spacing w:line="300" w:lineRule="auto"/>
                     <w:rPr>
                       <w:rFonts w:ascii="Times New Roman" w:hAnsi="Times New Roman" w:cs="Times New Roman"/>
                       <w:color w:val="auto"/>
@@ -5699,7 +5698,7 @@
                     <w:tabs>
                       <w:tab w:val="left" w:pos="1152"/>
                     </w:tabs>
-                    <w:spacing w:before="120" w:line="276" w:lineRule="auto"/>
+                    <w:spacing w:line="300" w:lineRule="auto"/>
                     <w:rPr>
                       <w:rFonts w:ascii="Times New Roman" w:hAnsi="Times New Roman" w:cs="Times New Roman"/>
                       <w:color w:val="auto"/>
@@ -5723,7 +5722,7 @@
                     <w:tabs>
                       <w:tab w:val="left" w:pos="1152"/>
                     </w:tabs>
-                    <w:spacing w:before="120" w:line="276" w:lineRule="auto"/>
+                    <w:spacing w:line="300" w:lineRule="auto"/>
                     <w:rPr>
                       <w:rFonts w:ascii="Times New Roman" w:hAnsi="Times New Roman" w:cs="Times New Roman"/>
                       <w:color w:val="auto"/>
@@ -5752,7 +5751,7 @@
                     <w:tabs>
                       <w:tab w:val="left" w:pos="1152"/>
                     </w:tabs>
-                    <w:spacing w:before="120" w:line="276" w:lineRule="auto"/>
+                    <w:spacing w:line="300" w:lineRule="auto"/>
                     <w:rPr>
                       <w:rFonts w:ascii="Times New Roman" w:hAnsi="Times New Roman" w:cs="Times New Roman"/>
                       <w:color w:val="auto"/>
@@ -5776,7 +5775,7 @@
                     <w:tabs>
                       <w:tab w:val="left" w:pos="1152"/>
                     </w:tabs>
-                    <w:spacing w:before="120" w:line="276" w:lineRule="auto"/>
+                    <w:spacing w:line="300" w:lineRule="auto"/>
                     <w:rPr>
                       <w:rFonts w:ascii="Times New Roman" w:hAnsi="Times New Roman" w:cs="Times New Roman"/>
                       <w:color w:val="auto"/>
@@ -5795,7 +5794,7 @@
           </w:tbl>
           <w:p>
             <w:pPr>
-              <w:spacing w:before="120" w:line="276" w:lineRule="auto"/>
+              <w:spacing w:line="300" w:lineRule="auto"/>
               <w:rPr>
                 <w:rFonts w:ascii="Times New Roman" w:hAnsi="Times New Roman" w:cs="Times New Roman"/>
                 <w:color w:val="auto"/>
@@ -5807,7 +5806,7 @@
     </w:tbl>
     <w:p>
       <w:pPr>
-        <w:spacing w:before="120" w:line="276" w:lineRule="auto"/>
+        <w:spacing w:line="300" w:lineRule="auto"/>
         <w:rPr>
           <w:rFonts w:ascii="Times New Roman" w:hAnsi="Times New Roman" w:cs="Times New Roman"/>
           <w:b/>
@@ -5825,7 +5824,7 @@
     </w:p>
     <w:p>
       <w:pPr>
-        <w:spacing w:before="120" w:line="276" w:lineRule="auto"/>
+        <w:spacing w:line="300" w:lineRule="auto"/>
         <w:rPr>
           <w:rFonts w:ascii="Times New Roman" w:hAnsi="Times New Roman" w:cs="Times New Roman"/>
           <w:color w:val="auto"/>
@@ -5874,7 +5873,7 @@
               <w:tabs>
                 <w:tab w:val="left" w:pos="1152"/>
               </w:tabs>
-              <w:spacing w:before="120" w:line="276" w:lineRule="auto"/>
+              <w:spacing w:line="300" w:lineRule="auto"/>
               <w:rPr>
                 <w:rFonts w:ascii="Times New Roman" w:hAnsi="Times New Roman" w:cs="Times New Roman"/>
                 <w:color w:val="auto"/>
@@ -5905,7 +5904,7 @@
               <w:tabs>
                 <w:tab w:val="left" w:pos="1152"/>
               </w:tabs>
-              <w:spacing w:before="120" w:line="276" w:lineRule="auto"/>
+              <w:spacing w:line="300" w:lineRule="auto"/>
               <w:rPr>
                 <w:rFonts w:ascii="Times New Roman" w:hAnsi="Times New Roman" w:cs="Times New Roman"/>
                 <w:color w:val="auto"/>
@@ -5944,7 +5943,7 @@
               <w:tabs>
                 <w:tab w:val="left" w:pos="1152"/>
               </w:tabs>
-              <w:spacing w:before="120" w:line="276" w:lineRule="auto"/>
+              <w:spacing w:line="300" w:lineRule="auto"/>
               <w:rPr>
                 <w:rFonts w:ascii="Times New Roman" w:hAnsi="Times New Roman" w:cs="Times New Roman"/>
                 <w:color w:val="auto"/>
@@ -5963,7 +5962,7 @@
     </w:tbl>
     <w:p>
       <w:pPr>
-        <w:spacing w:before="120" w:line="276" w:lineRule="auto"/>
+        <w:spacing w:line="300" w:lineRule="auto"/>
         <w:rPr>
           <w:rFonts w:ascii="Times New Roman" w:hAnsi="Times New Roman" w:cs="Times New Roman"/>
           <w:b/>
@@ -5998,7 +5997,7 @@
     </w:p>
     <w:p>
       <w:pPr>
-        <w:spacing w:before="120" w:line="276" w:lineRule="auto"/>
+        <w:spacing w:line="300" w:lineRule="auto"/>
         <w:jc w:val="both"/>
         <w:rPr>
           <w:rFonts w:ascii="Times New Roman" w:hAnsi="Times New Roman" w:cs="Times New Roman"/>
@@ -6038,7 +6037,7 @@
           </w:tcPr>
           <w:p>
             <w:pPr>
-              <w:spacing w:before="120" w:line="276" w:lineRule="auto"/>
+              <w:spacing w:line="300" w:lineRule="auto"/>
               <w:jc w:val="both"/>
               <w:rPr>
                 <w:rFonts w:ascii="Times New Roman" w:hAnsi="Times New Roman" w:cs="Times New Roman"/>
@@ -6069,7 +6068,7 @@
           </w:tcPr>
           <w:p>
             <w:pPr>
-              <w:spacing w:before="120" w:line="276" w:lineRule="auto"/>
+              <w:spacing w:line="300" w:lineRule="auto"/>
               <w:jc w:val="both"/>
               <w:rPr>
                 <w:rFonts w:ascii="Times New Roman" w:hAnsi="Times New Roman" w:cs="Times New Roman"/>
@@ -6098,7 +6097,7 @@
     </w:tbl>
     <w:p>
       <w:pPr>
-        <w:spacing w:before="120" w:line="276" w:lineRule="auto"/>
+        <w:spacing w:line="300" w:lineRule="auto"/>
         <w:jc w:val="both"/>
         <w:rPr>
           <w:rFonts w:ascii="Times New Roman" w:hAnsi="Times New Roman" w:cs="Times New Roman"/>
@@ -6115,7 +6114,7 @@
     </w:p>
     <w:p>
       <w:pPr>
-        <w:spacing w:before="120" w:line="276" w:lineRule="auto"/>
+        <w:spacing w:line="300" w:lineRule="auto"/>
         <w:jc w:val="both"/>
         <w:rPr>
           <w:rFonts w:ascii="Times New Roman" w:hAnsi="Times New Roman" w:cs="Times New Roman"/>
@@ -6127,12 +6126,13 @@
           <w:rFonts w:ascii="Times New Roman" w:hAnsi="Times New Roman" w:cs="Times New Roman"/>
           <w:color w:val="auto"/>
         </w:rPr>
+        <w:lastRenderedPageBreak/>
         <w:t>Tôi cam kết:</w:t>
       </w:r>
     </w:p>
     <w:p>
       <w:pPr>
-        <w:spacing w:before="120" w:line="276" w:lineRule="auto"/>
+        <w:spacing w:line="300" w:lineRule="auto"/>
         <w:jc w:val="both"/>
         <w:rPr>
           <w:rFonts w:ascii="Times New Roman" w:hAnsi="Times New Roman" w:cs="Times New Roman"/>
@@ -6149,7 +6149,7 @@
     </w:p>
     <w:p>
       <w:pPr>
-        <w:spacing w:before="120" w:line="276" w:lineRule="auto"/>
+        <w:spacing w:line="300" w:lineRule="auto"/>
         <w:jc w:val="both"/>
         <w:rPr>
           <w:rFonts w:ascii="Times New Roman" w:hAnsi="Times New Roman" w:cs="Times New Roman"/>
@@ -6166,7 +6166,7 @@
     </w:p>
     <w:p>
       <w:pPr>
-        <w:spacing w:before="120" w:line="276" w:lineRule="auto"/>
+        <w:spacing w:line="300" w:lineRule="auto"/>
         <w:jc w:val="both"/>
         <w:rPr>
           <w:rFonts w:ascii="Times New Roman" w:hAnsi="Times New Roman" w:cs="Times New Roman"/>
@@ -6183,7 +6183,7 @@
     </w:p>
     <w:p>
       <w:pPr>
-        <w:spacing w:before="120" w:line="276" w:lineRule="auto"/>
+        <w:spacing w:line="300" w:lineRule="auto"/>
         <w:jc w:val="both"/>
         <w:rPr>
           <w:rFonts w:ascii="Times New Roman" w:hAnsi="Times New Roman" w:cs="Times New Roman"/>
@@ -6220,7 +6220,7 @@
               <w:tabs>
                 <w:tab w:val="left" w:pos="1152"/>
               </w:tabs>
-              <w:spacing w:before="120" w:line="276" w:lineRule="auto"/>
+              <w:spacing w:line="300" w:lineRule="auto"/>
               <w:rPr>
                 <w:rFonts w:ascii="Times New Roman" w:hAnsi="Times New Roman" w:cs="Times New Roman"/>
                 <w:color w:val="auto"/>
@@ -6237,7 +6237,7 @@
               <w:tabs>
                 <w:tab w:val="left" w:pos="1152"/>
               </w:tabs>
-              <w:spacing w:before="120" w:line="276" w:lineRule="auto"/>
+              <w:spacing w:line="300" w:lineRule="auto"/>
               <w:jc w:val="center"/>
               <w:rPr>
                 <w:rFonts w:ascii="Times New Roman" w:hAnsi="Times New Roman" w:cs="Times New Roman"/>
@@ -6279,7 +6279,7 @@
               <w:tabs>
                 <w:tab w:val="left" w:pos="1152"/>
               </w:tabs>
-              <w:spacing w:before="120" w:line="276" w:lineRule="auto"/>
+              <w:spacing w:line="300" w:lineRule="auto"/>
               <w:rPr>
                 <w:rFonts w:ascii="Times New Roman" w:hAnsi="Times New Roman" w:cs="Times New Roman"/>
                 <w:i/>
@@ -6293,7 +6293,7 @@
               <w:tabs>
                 <w:tab w:val="left" w:pos="1152"/>
               </w:tabs>
-              <w:spacing w:before="120" w:line="276" w:lineRule="auto"/>
+              <w:spacing w:line="300" w:lineRule="auto"/>
               <w:rPr>
                 <w:rFonts w:ascii="Times New Roman" w:hAnsi="Times New Roman" w:cs="Times New Roman"/>
                 <w:i/>
@@ -6307,7 +6307,7 @@
               <w:tabs>
                 <w:tab w:val="left" w:pos="1152"/>
               </w:tabs>
-              <w:spacing w:before="120" w:line="276" w:lineRule="auto"/>
+              <w:spacing w:line="300" w:lineRule="auto"/>
               <w:rPr>
                 <w:rFonts w:ascii="Times New Roman" w:hAnsi="Times New Roman" w:cs="Times New Roman"/>
                 <w:i/>
@@ -6321,7 +6321,7 @@
               <w:tabs>
                 <w:tab w:val="left" w:pos="1152"/>
               </w:tabs>
-              <w:spacing w:before="120" w:line="276" w:lineRule="auto"/>
+              <w:spacing w:line="300" w:lineRule="auto"/>
               <w:jc w:val="center"/>
               <w:rPr>
                 <w:rFonts w:ascii="Times New Roman" w:hAnsi="Times New Roman" w:cs="Times New Roman"/>
@@ -6345,7 +6345,7 @@
               <w:tabs>
                 <w:tab w:val="left" w:pos="1152"/>
               </w:tabs>
-              <w:spacing w:before="120" w:line="276" w:lineRule="auto"/>
+              <w:spacing w:line="300" w:lineRule="auto"/>
               <w:jc w:val="center"/>
               <w:rPr>
                 <w:rFonts w:ascii="Times New Roman" w:hAnsi="Times New Roman" w:cs="Times New Roman"/>
@@ -6371,7 +6371,7 @@
     </w:tbl>
     <w:p>
       <w:pPr>
-        <w:spacing w:before="120" w:line="276" w:lineRule="auto"/>
+        <w:spacing w:line="300" w:lineRule="auto"/>
         <w:rPr>
           <w:rFonts w:ascii="Times New Roman" w:hAnsi="Times New Roman" w:cs="Times New Roman"/>
           <w:color w:val="auto"/>

</xml_diff>